<commit_message>
Update R Markdown templates with GHformats branding
- Update HTML templates (material and simple) with new logo references
- Update PDF report template (LaTeX, skeleton, bibliography)
- Update PDF simple template with new branding
- Update Word document templates with GHformats styling
- Update font files for PDF reports
- Add skeleton.ipynb for rmd_to_jupyter template
- Add images directory for PDF simple template

Co-Authored-By: Claude Sonnet 4.5 <noreply@anthropic.com>
</commit_message>
<xml_diff>
--- a/inst/rmarkdown/templates/word_doc/resources/gh-template-HelveticaNeue.docx
+++ b/inst/rmarkdown/templates/word_doc/resources/gh-template-HelveticaNeue.docx
@@ -77,14 +77,6 @@
         </w:rPr>
         <w:t>2022/07/20</w:t>
       </w:r>
-    </w:p>
-    <w:p>
-      <w:pPr>
-        <w:rPr>
-          <w:rFonts w:ascii="Helvetica Neue" w:hAnsi="Helvetica Neue"/>
-          <w:lang w:val="en-US"/>
-        </w:rPr>
-      </w:pPr>
     </w:p>
     <w:sectPr>
       <w:headerReference w:type="default" r:id="rId7"/>
@@ -236,17 +228,17 @@
       <w:pStyle w:val="Header"/>
       <w:jc w:val="right"/>
     </w:pPr>
-    <w:r>
-      <w:t xml:space="preserve">Running </w:t>
-    </w:r>
-    <w:proofErr w:type="spellStart"/>
-    <w:r>
-      <w:t>Document</w:t>
-    </w:r>
-    <w:proofErr w:type="spellEnd"/>
-    <w:r>
-      <w:t xml:space="preserve"> Title</w:t>
-    </w:r>
+    <w:fldSimple w:instr=" STYLEREF &quot;Heading 1&quot; \* MERGEFORMAT ">
+      <w:r>
+        <w:rPr>
+          <w:b/>
+          <w:bCs/>
+          <w:noProof/>
+          <w:lang w:val="en-US"/>
+        </w:rPr>
+        <w:t>Foo</w:t>
+      </w:r>
+    </w:fldSimple>
   </w:p>
 </w:hdr>
 </file>
@@ -2623,9 +2615,9 @@
     <w:name w:val="Hyperlink"/>
     <w:basedOn w:val="DefaultParagraphFont"/>
     <w:uiPriority w:val="99"/>
-    <w:rsid w:val="00AB5A90"/>
-    <w:rPr>
-      <w:color w:val="0271BB" w:themeColor="hyperlink"/>
+    <w:rsid w:val="00E04D5B"/>
+    <w:rPr>
+      <w:color w:val="B70000"/>
       <w:u w:val="single"/>
     </w:rPr>
   </w:style>
@@ -2908,7 +2900,6 @@
     <w:next w:val="Normal"/>
     <w:link w:val="DateChar"/>
     <w:uiPriority w:val="99"/>
-    <w:semiHidden/>
     <w:unhideWhenUsed/>
     <w:rsid w:val="00725CBC"/>
     <w:pPr>
@@ -2925,7 +2916,6 @@
     <w:basedOn w:val="DefaultParagraphFont"/>
     <w:link w:val="Date"/>
     <w:uiPriority w:val="99"/>
-    <w:semiHidden/>
     <w:rsid w:val="00725CBC"/>
     <w:rPr>
       <w:rFonts w:asciiTheme="majorHAnsi" w:hAnsiTheme="majorHAnsi"/>

</xml_diff>